<commit_message>
fix: owner dictations resolve 8 unclear antecedents + Pusey 'hast made'
- Ch4 abyss encounter completed; Ch5 transcendentals + God-rests
  sentences recast; Ch6 'other Christs' + welcome passage; epilogue
  solar-flare + veils/screens dictations (4 redundant sentences
  removed); Ch3 OT-liturgies/Mary prevenient-grace dictation
- Pusey: 'Thou hast made us' per owner preference (deviation from
  Gutenberg noted in provenance)
- FLAG: owner dictation contains 'make a total give of themselves'
  (likely 'gift') — printed verbatim, flagged for owner
- Rebuilt: 103 pp, 18/18 checks, parity 0.994, docx regenerated
</commit_message>
<xml_diff>
--- a/manuscript/Mystery_of_the_Trinity.docx
+++ b/manuscript/Mystery_of_the_Trinity.docx
@@ -1822,7 +1822,7 @@
           <w:b w:val="0"/>
           <w:i w:val="0"/>
         </w:rPr>
-        <w:t>." When she said "Mine," she cut herself off from communion with God and with Adam. And Adam shared in that fall. Thus cut off, humanity waited to be united. All the liturgies of the Old Testament, all the rituals and sacrifices, all the prayers and the psalms, everything pointed to a time when that would be satisfied, when we could make that full response. And it was not until grace entered into creation again, preveniently, in the soul of the Blessed Virgin Mary at the moment of her conception, that God could find within humanity a way to respond.</w:t>
+        <w:t>." When she said "Mine," she cut herself off from communion with God and with Adam. And Adam shared in that fall. Thus cut off, humanity waited to be united. All the liturgies of the Old Testament — all the rituals and sacrifices, all the prayers and the psalms — everything pointed to a time when humanity could make that full response. And it was not until grace entered into creation again, preveniently, in the soul of the Blessed Virgin Mary at the moment of her conception, that God could find within humanity a response.</w:t>
       </w:r>
     </w:p>
     <w:p>
@@ -2703,7 +2703,7 @@
           <w:b w:val="0"/>
           <w:i w:val="0"/>
         </w:rPr>
-        <w:t>Instead, we are to encounter from the depths of our being an infinite abyss of our existence.</w:t>
+        <w:t>Instead, we are to encounter, from the depths of our being, an infinite abyss of existence in another person.</w:t>
       </w:r>
     </w:p>
     <w:p>
@@ -3097,7 +3097,7 @@
           <w:b w:val="0"/>
           <w:i w:val="0"/>
         </w:rPr>
-        <w:t>So that means all reality, then, has a share not only in truth and goodness — and not maybe beauty, also — but also relationality. And that makes sense, because we can only speak of a water bottle in relation to my ability to drink, my ability to have that, and I get to consume it. There is a relationality with all material things. Even the things that we do not yet see — the tree that falls in the forest with no one around — there is still relationality built into all of these things: that coming together of one thing and another thing. There is relationality built into all material creation, all immaterial creation. All things share in this relationality. This also means that there is no escaping God — yes.</w:t>
+        <w:t>So that means all reality, then, has a share not only in truth, goodness, and beauty, but also relationality. And that makes sense, because we can only speak of a water bottle in relation to my ability to drink, my ability to have that, and I get to consume it. There is a relationality with all material things. Even the things that we do not yet see — the tree that falls in the forest with no one around — there is still relationality built into all of these things: that coming together of one thing and another thing. There is relationality built into all material creation, all immaterial creation. All things share in this relationality. This also means that there is no escaping God — yes.</w:t>
       </w:r>
     </w:p>
     <w:p>
@@ -3611,7 +3611,7 @@
           <w:b w:val="0"/>
           <w:i w:val="0"/>
         </w:rPr>
-        <w:t>And this God who created in six days and rested on the seventh, this God, this very God — God, I desire to rest in you — and your hearts and your souls. Never mind the chaos. Never mind the storms. I am with you.</w:t>
+        <w:t>And this God — who created in six days and rested on the seventh — desires to rest in you, in your hearts and your souls. Never mind the chaos. Never mind the storms. I am with you.</w:t>
       </w:r>
     </w:p>
     <w:p>
@@ -3990,7 +3990,7 @@
           <w:b w:val="0"/>
           <w:i w:val="0"/>
         </w:rPr>
-        <w:t>Who, having a light, puts it under a basket? No, you put it on a lampstand to shine out. "You are the light of the world," Christ says. He also says, "I am the light of the world." Both of these are true, for we are the light of the world because we are other Christ. We shine out with the same light so others might only see him. And from that, the light is spread.</w:t>
+        <w:t>Who, having a light, puts it under a basket? No, you put it on a lampstand to shine out. "You are the light of the world," Christ says. He also says, "I am the light of the world." Both of these are true, for we are the light of the world because we are other Christs. We shine out with the same light so others might only see him. And from that, the light is spread.</w:t>
       </w:r>
     </w:p>
     <w:p>
@@ -4372,7 +4372,7 @@
           <w:b w:val="0"/>
           <w:i w:val="0"/>
         </w:rPr>
-        <w:t>We are now to spread [possibly: mercy] to everyone else as well, and to go forth and to welcome — just in the same way as we welcome Christ in our own hearts — welcome those that we do not want to have any part in us [unclear], those we would rather protect ourselves from. Welcome, then, with forgiveness; welcome them with compassion, to share in their own sufferings, and then to help draw them. We might be the means by which others encounter the same Trinitarian love. And our baptisms are not meant to terminate within us. They are meant to impel us forward as well, to make disciples of all nations, so that others might be baptized in the name of the Father and of the Son and of the Holy Spirit.</w:t>
+        <w:t>We are now to spread [possibly: mercy] to everyone else as well, and to go forth and to welcome — just in the same way as we welcome Christ in our own hearts — we welcome those who most reject us, those we would rather protect ourselves from. Welcome, then, with forgiveness; welcome them with compassion, to share in their own sufferings, and then to help draw them. We might be the means by which others encounter the same Trinitarian love. And our baptisms are not meant to terminate within us. They are meant to impel us forward as well, to make disciples of all nations, so that others might be baptized in the name of the Father and of the Son and of the Holy Spirit.</w:t>
       </w:r>
     </w:p>
     <w:p>
@@ -4870,7 +4870,7 @@
           <w:b w:val="0"/>
           <w:i w:val="0"/>
         </w:rPr>
-        <w:t>Seeing that we are included in this mystery — that it was like a solar flare out of the love of God, Father, Son, and Holy Spirit — and that even all things were created. The excess, the abundance of God's love spilled out, strewn across the sky — the stars, the distant galaxies, all the details of the earth. And out of this, God looked for someone who would share in his image and likeness, who could respond — who we are as human beings — who could participate in God. We could reflect him. We could give of ourselves. We could receive others. There would be persons who were embodied. So we are included in the mystery of creation. We can study creation from a distance, but we are studying ourselves in the process.</w:t>
+        <w:t>We are included in this mystery — this mystery that is like a solar flare out of the love of God, Father, Son, and Holy Spirit. Out of all things that were created — the excess, the abundance of God's love spilled out and strewn across the sky — God looked for someone who would share in his image and likeness, who could respond, who could reflect him, who could make a total give of themselves, who could receive others. We are thus included in the mystery of creation, implicated in its mystery. When we study creation, we are studying ourselves in the process. And we are examining the echo of the Trinity.</w:t>
       </w:r>
     </w:p>
     <w:p>
@@ -5097,7 +5097,7 @@
           <w:b w:val="0"/>
           <w:i w:val="0"/>
         </w:rPr>
-        <w:t>St. Augustine said he looked for God outside of himself, looking to fill himself up with the things of this world. But at last, he looked into his heart, and he found God there. "Too late loved I Thee, O Thou Beauty of ancient days, yet ever new! too late I loved Thee! … Thou madest us for Thyself, and our heart is restless, until it repose in Thee." God envelops us with the mystery of his love. His Trinitarian love spills out to us. We are included in that love. He is more intimate. He is closer to me than I am to myself.</w:t>
+        <w:t>St. Augustine said he looked for God outside of himself, looking to fill himself up with the things of this world. But at last, he looked into his heart, and he found God there. "Too late loved I Thee, O Thou Beauty of ancient days, yet ever new! too late I loved Thee! … Thou hast made us for Thyself, and our heart is restless, until it repose in Thee." God envelops us with the mystery of his love. His Trinitarian love spills out to us. We are included in that love. He is more intimate. He is closer to me than I am to myself.</w:t>
       </w:r>
     </w:p>
     <w:p>
@@ -5415,7 +5415,7 @@
           <w:b w:val="0"/>
           <w:i w:val="0"/>
         </w:rPr>
-        <w:t>Dissipation is the enemy of recollection. Dissipation prevents us from experiencing reality as mystery. It gives us a false, counterfeit sense of control. And yet it controls us. We are enslaved. We are reduced. We have screens. Screens block out the mystery. The abstract veils — they clothe mystery; they accentuate the details of it; they show what is behind the veil. We do not look at the veils. We are stuck looking at screens. We are blocked. This is a great enemy of the interior life.</w:t>
+        <w:t>Dissipation is the enemy of recollection. Dissipation prevents us from experiencing reality as mystery. It gives us a false, counterfeit sense of control. And yet it controls us. We are enslaved. We are reduced. We have screens. Screens block out the mystery. Unlike screens, veils clothe mystery, they accentuate it; they show what is behind the veil. We do not look at the veils, we look beyond them. Yet so often, we are stuck looking at screens. We are blocked. This dissipation is a great enemy of the interior life.</w:t>
       </w:r>
     </w:p>
     <w:p>

</xml_diff>

<commit_message>
fix: RSV-2CE confirmed for all six readings + 'gift' typo
- Owner confirmed: all six confirm-list readings stay aligned to
  RSV-2CE; epilogue's indirect Rom 12:2 allusion aligned to 'this
  world' (pure-prose 'this age' idioms kept as author's phrasing)
- Solar-flare dictation: 'total give' -> 'total gift' per owner
- Rebuilt: 103 pp, 18/18 checks, docx regenerated
</commit_message>
<xml_diff>
--- a/manuscript/Mystery_of_the_Trinity.docx
+++ b/manuscript/Mystery_of_the_Trinity.docx
@@ -4870,7 +4870,7 @@
           <w:b w:val="0"/>
           <w:i w:val="0"/>
         </w:rPr>
-        <w:t>We are included in this mystery — this mystery that is like a solar flare out of the love of God, Father, Son, and Holy Spirit. Out of all things that were created — the excess, the abundance of God's love spilled out and strewn across the sky — God looked for someone who would share in his image and likeness, who could respond, who could reflect him, who could make a total give of themselves, who could receive others. We are thus included in the mystery of creation, implicated in its mystery. When we study creation, we are studying ourselves in the process. And we are examining the echo of the Trinity.</w:t>
+        <w:t>We are included in this mystery — this mystery that is like a solar flare out of the love of God, Father, Son, and Holy Spirit. Out of all things that were created — the excess, the abundance of God's love spilled out and strewn across the sky — God looked for someone who would share in his image and likeness, who could respond, who could reflect him, who could make a total gift of themselves, who could receive others. We are thus included in the mystery of creation, implicated in its mystery. When we study creation, we are studying ourselves in the process. And we are examining the echo of the Trinity.</w:t>
       </w:r>
     </w:p>
     <w:p>
@@ -5143,7 +5143,7 @@
           <w:b w:val="0"/>
           <w:i w:val="0"/>
         </w:rPr>
-        <w:t>Part of the engineering worldview is that we have to work. We have to have success in order to make any kind of progress. The problem with school is you have to get your good grades. You go into your work, and you have to do what your boss expects of you. You have to live up to some standard of performance. And that way you might be rewarded with some kind of raise. That makes sense. That is the basic reward system that we have. It is the worldview that we have of this age — to not be conformed to this age, but to be transformed by the renewal of your mind. For God has already loved you. You do not have to do anything to prove it. How we live that out, then, is that we receive that love, and we respond.</w:t>
+        <w:t>Part of the engineering worldview is that we have to work. We have to have success in order to make any kind of progress. The problem with school is you have to get your good grades. You go into your work, and you have to do what your boss expects of you. You have to live up to some standard of performance. And that way you might be rewarded with some kind of raise. That makes sense. That is the basic reward system that we have. It is the worldview that we have of this age — to not be conformed to this world, but to be transformed by the renewal of your mind. For God has already loved you. You do not have to do anything to prove it. How we live that out, then, is that we receive that love, and we respond.</w:t>
       </w:r>
     </w:p>
     <w:p>

</xml_diff>

<commit_message>
feat: complete RSV-2CE verification (40/40), resolve 3 quote flags, prep reviewer packages
- RSV-2CE worksheet now 100% verified (all 12 remaining rows
  fetched via biblia.com previews); 2 alignment edits (Gen 1
  refrain 'It was good'; Jn 'I am the door/and the truth'), 3 rows
  blocked pending owner (dramatic paraphrase / spoken words /
  Mt 5:11 vs Lk 6:22 confirmation)
- Resolved: Gen 1:26 + Lk 2:49 flags removed (match RSV-2CE);
  2 Cor 12:2 -> 'caught up to the third heaven'
- research/theological_review_worksheet.md: 37 flags (19 accuracy,
  8 pastoral, 10 attribution) for the named reviewer
- research/listening_queue.md: 16 inline flags (8 LISTEN, 8 SOURCE)
  + 84 review-log open items triaged
- research/rights_review_list.md: 63 ledger rows grouped
  (public domain / needs decision / audio-derived)
- Rebuilt: 103 pp, 18/18, parity 0.994, docx regenerated
</commit_message>
<xml_diff>
--- a/manuscript/Mystery_of_the_Trinity.docx
+++ b/manuscript/Mystery_of_the_Trinity.docx
@@ -341,7 +341,7 @@
           <w:b w:val="0"/>
           <w:i w:val="0"/>
         </w:rPr>
-        <w:t>And so we might say the same of the first chapter of Genesis, when God says, "Let us make man in our image, after our likeness" [quotation wording unverified]. We who now know of God as one and three think that the "us," the plural, refers to the Trinity. And we are not wrong. Originally, it referred to the angels, the choirs of angels — "Let us make," God would speak to them. But for us, we can retroactively understand that in its fullest sense, God creates from the Trinity.</w:t>
+        <w:t>And so we might say the same of the first chapter of Genesis, when God says, "Let us make man in our image, after our likeness". We who now know of God as one and three think that the "us," the plural, refers to the Trinity. And we are not wrong. Originally, it referred to the angels, the choirs of angels — "Let us make," God would speak to them. But for us, we can retroactively understand that in its fullest sense, God creates from the Trinity.</w:t>
       </w:r>
     </w:p>
     <w:p>
@@ -479,7 +479,7 @@
           <w:b w:val="0"/>
           <w:i w:val="0"/>
         </w:rPr>
-        <w:t>And behind him is a house. Now, the house of Abraham and Sarah, sure. But also we recall our Lord's words in John 14, "In my Father's house are many rooms." Or we can go back to Luke 2, "Did you not know that I must be in my Father's house" [quotation wording unverified], that is, the temple. The temple in Jerusalem being the house of the Father, especially for Christ, the second person of the Holy Trinity incarnate. So there is the Father's house there, symbolized by the house of Abraham and Sarah.</w:t>
+        <w:t>And behind him is a house. Now, the house of Abraham and Sarah, sure. But also we recall our Lord's words in John 14, "In my Father's house are many rooms." Or we can go back to Luke 2, "Did you not know that I must be in my Father's house", that is, the temple. The temple in Jerusalem being the house of the Father, especially for Christ, the second person of the Holy Trinity incarnate. So there is the Father's house there, symbolized by the house of Abraham and Sarah.</w:t>
       </w:r>
     </w:p>
     <w:p>
@@ -725,7 +725,7 @@
           <w:b w:val="0"/>
           <w:i w:val="0"/>
         </w:rPr>
-        <w:t>And the relationality within the Trinity, the love of Father, Son, and Holy Spirit: we are made for relationship. We are made to pour ourselves out and to receive, to give and to receive, to reciprocate. We are inscribed in our very natures, so that when God looked upon creation all the other days, he said, "It is good" [quotation wording unverified]. He looked upon us created in his image and likeness, male and female, meant to enshrine that image of the Holy Trinity in their very bodies. He looked at us and said, "It was very good" [quotation wording unverified], for we are images of God's triune love.</w:t>
+        <w:t>And the relationality within the Trinity, the love of Father, Son, and Holy Spirit: we are made for relationship. We are made to pour ourselves out and to receive, to give and to receive, to reciprocate. We are inscribed in our very natures, so that when God looked upon creation all the other days, he said, "It was good" [quotation wording unverified]. He looked upon us created in his image and likeness, male and female, meant to enshrine that image of the Holy Trinity in their very bodies. He looked at us and said, "It was very good" [quotation wording unverified], for we are images of God's triune love.</w:t>
       </w:r>
     </w:p>
     <w:p>
@@ -2455,7 +2455,7 @@
           <w:b w:val="0"/>
           <w:i w:val="0"/>
         </w:rPr>
-        <w:t>Someone who goes through a mystical experience, I am told, is not able to communicate what happened in that experience. St. Paul sheepishly talks about how he knew a man who was lifted up into the ninth [possibly: third] heaven, whatever, some level of heaven. And he said, I do not know which — I do not know. And he cannot really tell much about it, because it is hard to tell. What you know in that way cannot be easily explained.</w:t>
+        <w:t>Someone who goes through a mystical experience, I am told, is not able to communicate what happened in that experience. St. Paul sheepishly talks about how he knew a man who was caught up to the third heaven, whatever, some level of heaven. And he said, I do not know which — I do not know. And he cannot really tell much about it, because it is hard to tell. What you know in that way cannot be easily explained.</w:t>
       </w:r>
     </w:p>
     <w:p>
@@ -2881,7 +2881,7 @@
           <w:b w:val="0"/>
           <w:i w:val="0"/>
         </w:rPr>
-        <w:t>Our Lord reiterates this. He has many "I am" statements, especially within the Gospel of John. "I am the gate. I am the vine. I am the way, the truth, and the life." It was on purpose that our Lord said "I am," because this harkens back to the name of God.</w:t>
+        <w:t>Our Lord reiterates this. He has many "I am" statements, especially within the Gospel of John. "I am the door. I am the vine. I am the way, and the truth, and the life." It was on purpose that our Lord said "I am," because this harkens back to the name of God.</w:t>
       </w:r>
     </w:p>
     <w:p>

</xml_diff>

<commit_message>
fix: resolve 3 ch1 quote flags (Jn 12:24 + Gen 1 refrains verified vs RSV)
</commit_message>
<xml_diff>
--- a/manuscript/Mystery_of_the_Trinity.docx
+++ b/manuscript/Mystery_of_the_Trinity.docx
@@ -536,7 +536,7 @@
           <w:b w:val="0"/>
           <w:i w:val="0"/>
         </w:rPr>
-        <w:t>And this is the part of the table that all three persons of the Trinity are not occupying, and we, as the viewer, are now part of this icon. We are meant, in some ways, to be invited into this feast, to share in the hospitality of Father, Son, and Holy Spirit. And how do we do so? And it is very poignant: the way in which we share in that hospitality is through martyrdom, through the witness of our lives. "Unless a grain of wheat falls into the earth and dies, it remains alone; but if it dies, it bears much fruit" [quotation wording unverified]. Our insertion into the Holy Trinity through Christ is through a sharing in his sufferings and his death on the cross.</w:t>
+        <w:t>And this is the part of the table that all three persons of the Trinity are not occupying, and we, as the viewer, are now part of this icon. We are meant, in some ways, to be invited into this feast, to share in the hospitality of Father, Son, and Holy Spirit. And how do we do so? And it is very poignant: the way in which we share in that hospitality is through martyrdom, through the witness of our lives. "Unless a grain of wheat falls into the earth and dies, it remains alone; but if it dies, it bears much fruit." Our insertion into the Holy Trinity through Christ is through a sharing in his sufferings and his death on the cross.</w:t>
       </w:r>
     </w:p>
     <w:p>
@@ -725,7 +725,7 @@
           <w:b w:val="0"/>
           <w:i w:val="0"/>
         </w:rPr>
-        <w:t>And the relationality within the Trinity, the love of Father, Son, and Holy Spirit: we are made for relationship. We are made to pour ourselves out and to receive, to give and to receive, to reciprocate. We are inscribed in our very natures, so that when God looked upon creation all the other days, he said, "It was good" [quotation wording unverified]. He looked upon us created in his image and likeness, male and female, meant to enshrine that image of the Holy Trinity in their very bodies. He looked at us and said, "It was very good" [quotation wording unverified], for we are images of God's triune love.</w:t>
+        <w:t>And the relationality within the Trinity, the love of Father, Son, and Holy Spirit: we are made for relationship. We are made to pour ourselves out and to receive, to give and to receive, to reciprocate. We are inscribed in our very natures, so that when God looked upon creation all the other days, he said, "It was good." He looked upon us created in his image and likeness, male and female, meant to enshrine that image of the Holy Trinity in their very bodies. He looked at us and said, "It was very good," for we are images of God's triune love.</w:t>
       </w:r>
     </w:p>
     <w:p>

</xml_diff>

<commit_message>
fix: owner batch-4 — final flag clearance + source resolutions
- All 8 listening resolutions applied (the Son, only, now, descend
  into hell, Liquid Death omitted, Father Michael, confession, mercy)
- Thérèse line -> CCC para 2558 verified wording (not 2658 — worker
  corrected on vatican.va)
- 1 Jn 3:2 -> unattributed paraphrase (Eucharistic-Prayer clause
  removed); Augustine Ascension -> paraphrase, flag removed;
  Ignatius attribution kept per owner; Augustine wound -> hedge +
  SRC-045 PARAPHRASE_CONFIRMED with X.41.66 endnote; Mt 5:11 ->
  RSV-2CE wording
- CHAPTER PROSE IS NOW FLAG-FREE: 0 [possibly]/[unclear]/[quotation
  wording unverified] across all 7 chapters
- Rebuilt: 103 pp, 18/18 checks, parity 0.994, docx regenerated
</commit_message>
<xml_diff>
--- a/manuscript/Mystery_of_the_Trinity.docx
+++ b/manuscript/Mystery_of_the_Trinity.docx
@@ -644,7 +644,7 @@
           <w:b w:val="0"/>
           <w:i w:val="0"/>
         </w:rPr>
-        <w:t>Not only that, the actions matter. When we lift our hands towards our foreheads, this upward motion of our hands goes along with "In the name of the Father." That upward motion is this pilgrimage all of us are making to the embrace of God the Father. We who have come forth from the Father are now meant to go towards him in our prayer. This is that simple glance directed towards heaven that St. Thérèse talks about when she says, "What is prayer but a simple glance directed towards heaven?" [quotation wording unverified] In the name of the Father.</w:t>
+        <w:t>Not only that, the actions matter. When we lift our hands towards our foreheads, this upward motion of our hands goes along with "In the name of the Father." That upward motion is this pilgrimage all of us are making to the embrace of God the Father. We who have come forth from the Father are now meant to go towards him in our prayer. This is that simple glance directed towards heaven that St. Thérèse talks about when, in the words the Catechism quotes from her, "prayer is a surge of the heart; it is a simple look turned toward heaven, it is a cry of recognition and of love, embracing both trial and joy." In the name of the Father.</w:t>
       </w:r>
     </w:p>
     <w:p>
@@ -1677,7 +1677,7 @@
           <w:b w:val="0"/>
           <w:i w:val="0"/>
         </w:rPr>
-        <w:t>I kind of like to do this, too. If you put your fingers together in front of you, it looks like there is a third finger that appears between them. That is not a great analogy, but I like it — how the Holy Spirit comes between [unclear] and the Father. That love is personal. This is sufficient from all eternity.</w:t>
+        <w:t>I kind of like to do this, too. If you put your fingers together in front of you, it looks like there is a third finger that appears between them. That is not a great analogy, but I like it — how the Holy Spirit comes between the Son and the Father. That love is personal. This is sufficient from all eternity.</w:t>
       </w:r>
     </w:p>
     <w:p>
@@ -1982,7 +1982,7 @@
           <w:b w:val="0"/>
           <w:i w:val="0"/>
         </w:rPr>
-        <w:t>The liturgies of the Church — the rites of the Church that regard the sacraments — sometimes these rites are done within the Mass but are distinct rites; they are liturgical acts. I do not make up the words of the Eucharistic Prayer, for example. That would be wrong. The Church says, no, you have to use these words. You have options, but you can [possibly: only] use these words. But other prayers could be influenced by Scripture, which is also received — and Scripture is meant to be proclaimed liturgically. The Liturgy of the Word is actually a prayer to God the Father first and foremost.</w:t>
+        <w:t>The liturgies of the Church — the rites of the Church that regard the sacraments — sometimes these rites are done within the Mass but are distinct rites; they are liturgical acts. I do not make up the words of the Eucharistic Prayer, for example. That would be wrong. The Church says, no, you have to use these words. You have options, but you can only use these words. But other prayers could be influenced by Scripture, which is also received — and Scripture is meant to be proclaimed liturgically. The Liturgy of the Word is actually a prayer to God the Father first and foremost.</w:t>
       </w:r>
     </w:p>
     <w:p>
@@ -2142,7 +2142,7 @@
           <w:b w:val="0"/>
           <w:i w:val="0"/>
         </w:rPr>
-        <w:t>Recall John Paul II's Theology of the Body. He speaks often of the law of the gift, as it is commonly called. In this world, when we give something away, a material thing, I no longer have this. I give this folder over. It is no longer mine. I give it to this person here. Gift is a mystery. You know your intentions behind a gift, but you do not understand how the receiver is also receiving. These two things are joined together. It is too much to go into [unclear], but it is already including us. But in the world of grace, when I give, I do not lose. In fact, I gain. Giving over something, we gain. Our response to all of God's creation, all of God's gifts, every one of God's blessings, is that of thanksgiving and praise.</w:t>
+        <w:t>Recall John Paul II's Theology of the Body. He speaks often of the law of the gift, as it is commonly called. In this world, when we give something away, a material thing, I no longer have this. I give this folder over. It is no longer mine. I give it to this person here. Gift is a mystery. You know your intentions behind a gift, but you do not understand how the receiver is also receiving. These two things are joined together. It is too much to go into now, but it is already including us. But in the world of grace, when I give, I do not lose. In fact, I gain. Giving over something, we gain. Our response to all of God's creation, all of God's gifts, every one of God's blessings, is that of thanksgiving and praise.</w:t>
       </w:r>
     </w:p>
     <w:p>
@@ -2313,7 +2313,7 @@
           <w:b w:val="0"/>
           <w:i w:val="0"/>
         </w:rPr>
-        <w:t>In his house, there are many rooms. There is welcome for the sinner. There is a place that is set aside for us. We return to the Father — like the prodigal son — joined with Christ in the Paschal mystery, where he who has come forth from the Father has done his own pouring out to enter into creation, and to take on our sins, our sufferings — to die, to enter into hell [unclear], to rise from the dead, and to say, "I will arise and go to my father." He goes — like the prodigal son, but never having sinned — to God the Father. He joins us with himself, and we make that full return through Christ and his passion, death, resurrection, and ascension. And we are called into that heavenly liturgy — the worship of God in heaven — which we participate in now by following God's will for us, to enter into that most sacred celebration here and now.</w:t>
+        <w:t>In his house, there are many rooms. There is welcome for the sinner. There is a place that is set aside for us. We return to the Father — like the prodigal son — joined with Christ in the Paschal mystery, where he who has come forth from the Father has done his own pouring out to enter into creation, and to take on our sins, our sufferings — to die, to descend into hell, to rise from the dead, and to say, "I will arise and go to my father." He goes — like the prodigal son, but never having sinned — to God the Father. He joins us with himself, and we make that full return through Christ and his passion, death, resurrection, and ascension. And we are called into that heavenly liturgy — the worship of God in heaven — which we participate in now by following God's will for us, to enter into that most sacred celebration here and now.</w:t>
       </w:r>
     </w:p>
     <w:p>
@@ -2947,7 +2947,7 @@
           <w:b w:val="0"/>
           <w:i w:val="0"/>
         </w:rPr>
-        <w:t>But then, it is not like pantheism, right — no, we all participate in God. Everything participates in God. So that a Liquid Death can [possibly: brand name — verify audio] — it exists, right? Everything participates in God. You might think objects do not. Yes, they do. By being a can, it does. But you participate not just by existing, but also by your free choice to cooperate and to respond to God — and that is a participation a little bit higher.</w:t>
+        <w:t>But then, it is not like pantheism, right — no, we all participate in God. Everything participates in God. You might think objects do not. Yes, they do. By merely existing, it does. But you participate not just by existing, but also by your free choice to cooperate and to respond to God — and that is a participation a little bit higher.</w:t>
       </w:r>
     </w:p>
     <w:p>
@@ -3347,7 +3347,7 @@
           <w:b w:val="0"/>
           <w:i w:val="0"/>
         </w:rPr>
-        <w:t>Contemplate him in the holy Eucharist, and we become like him — for we shall see him as he really is, for we will be like him [quotation wording unverified] — as it says in one of the Eucharistic prayers of the Mass. We become like God, and our knowledge of God is not merely from study — sometimes aided by our study — but it becomes the likeness of God on our souls. We who live godly lives know God from the inside — not from the outside in, but from the inside out.</w:t>
+        <w:t>Contemplate him in the holy Eucharist, and we become like him — for we shall see him as he really is, for we will be like him. We become like God, and our knowledge of God is not merely from study — sometimes aided by our study — but it becomes the likeness of God on our souls. We who live godly lives know God from the inside — not from the outside in, but from the inside out.</w:t>
       </w:r>
     </w:p>
     <w:p>
@@ -3510,7 +3510,7 @@
           <w:b w:val="0"/>
           <w:i w:val="0"/>
         </w:rPr>
-        <w:t>St. Augustine said that when Christ ascended into heaven, he ascended from the apostles' eyes so they might turn towards their hearts and find him there, because within us, God rests. [quotation wording unverified]</w:t>
+        <w:t>St. Augustine said that when Christ ascended into heaven, he ascended from the apostles' eyes so they might turn towards their hearts and find him there, because within us, God rests.</w:t>
       </w:r>
     </w:p>
     <w:p>
@@ -4012,7 +4012,7 @@
           <w:b w:val="0"/>
           <w:i w:val="0"/>
         </w:rPr>
-        <w:t>The mission of evangelization — we remember how St. Ignatius of Loyola would say to his missionaries, the Jesuits of the 16th century, as they were being sent out into the four corners of the world to spread the gospel to people who have never heard it before: "Go, set the world on fire." [quotation wording unverified] We burn with that love, that catching force of the sympathetic influence, that others might see Christ in us and be influenced by it.</w:t>
+        <w:t>The mission of evangelization — we remember how St. Ignatius of Loyola would say to his missionaries, the Jesuits of the 16th century, as they were being sent out into the four corners of the world to spread the gospel to people who have never heard it before: "Go, set the world on fire." We burn with that love, that catching force of the sympathetic influence, that others might see Christ in us and be influenced by it.</w:t>
       </w:r>
     </w:p>
     <w:p>
@@ -4247,18 +4247,18 @@
           <w:b w:val="0"/>
           <w:i w:val="0"/>
         </w:rPr>
-        <w:t>Do not just teach the Trinity. To live the Trinity means to love them as persons. We are tempted to have that dividing line — there is us and them. But there is no peace in thinking this way. This is the peace the world gives. As Father [possibly: Michael] often says, it is the peace that comes from the unity of everyone minus one. It is how we can scapegoat. But that is not how we are to live.</w:t>
-      </w:r>
-    </w:p>
-    <w:p>
-      <w:pPr/>
-      <w:r>
-        <w:rPr>
-          <w:rFonts w:ascii="Garamond" w:hAnsi="Garamond"/>
-          <w:b w:val="0"/>
-          <w:i w:val="0"/>
-        </w:rPr>
-        <w:t>The mystery of the Trinity does embrace all. All things make sense by it. All persons are meant to be included in it — if not just by nature, but by grace as well. So to live from the love of the Trinity means to love all those — even those that hate us — as our Lord says, "Blessed are you when you are hated and persecuted for my name." We can share that blessedness if we make sure to give of ourselves and be truly vulnerable.</w:t>
+        <w:t>Do not just teach the Trinity. To live the Trinity means to love them as persons. We are tempted to have that dividing line — there is us and them. But there is no peace in thinking this way. This is the peace the world gives. As Father Michael often says, it is the peace that comes from the unity of everyone minus one. It is how we can scapegoat. But that is not how we are to live.</w:t>
+      </w:r>
+    </w:p>
+    <w:p>
+      <w:pPr/>
+      <w:r>
+        <w:rPr>
+          <w:rFonts w:ascii="Garamond" w:hAnsi="Garamond"/>
+          <w:b w:val="0"/>
+          <w:i w:val="0"/>
+        </w:rPr>
+        <w:t>The mystery of the Trinity does embrace all. All things make sense by it. All persons are meant to be included in it — if not just by nature, but by grace as well. So to live from the love of the Trinity means to love all those — even those that hate us — as our Lord says, "Blessed are you when men revile you and persecute you and utter all kinds of evil against you falsely on my account." We can share that blessedness if we make sure to give of ourselves and be truly vulnerable.</w:t>
       </w:r>
     </w:p>
     <w:p>
@@ -4350,7 +4350,7 @@
           <w:b w:val="0"/>
           <w:i w:val="0"/>
         </w:rPr>
-        <w:t>And in every single person we can see the mystery of Christ and his redemption, his yearning for us. Some of us are waiting to be activated. Some of us are dead in our sins, waiting for Christ to rise again and go to the Father. Christ has come to us in our brokenness and has forgiven us our sins — our venial sins even in the holy Eucharist, and our mortal sins through the sacrament of [possibly: confession]. All of us, though, are meant to share in that divine life.</w:t>
+        <w:t>And in every single person we can see the mystery of Christ and his redemption, his yearning for us. Some of us are waiting to be activated. Some of us are dead in our sins, waiting for Christ to rise again and go to the Father. Christ has come to us in our brokenness and has forgiven us our sins — our venial sins even in the holy Eucharist, and our mortal sins through the sacrament of confession. All of us, though, are meant to share in that divine life.</w:t>
       </w:r>
     </w:p>
     <w:p>
@@ -4372,7 +4372,7 @@
           <w:b w:val="0"/>
           <w:i w:val="0"/>
         </w:rPr>
-        <w:t>We are now to spread [possibly: mercy] to everyone else as well, and to go forth and to welcome — just in the same way as we welcome Christ in our own hearts — we welcome those who most reject us, those we would rather protect ourselves from. Welcome, then, with forgiveness; welcome them with compassion, to share in their own sufferings, and then to help draw them. We might be the means by which others encounter the same Trinitarian love. And our baptisms are not meant to terminate within us. They are meant to impel us forward as well, to make disciples of all nations, so that others might be baptized in the name of the Father and of the Son and of the Holy Spirit.</w:t>
+        <w:t>We are now to spread mercy to everyone else as well, and to go forth and to welcome — just in the same way as we welcome Christ in our own hearts — we welcome those who most reject us, those we would rather protect ourselves from. Welcome, then, with forgiveness; welcome them with compassion, to share in their own sufferings, and then to help draw them. We might be the means by which others encounter the same Trinitarian love. And our baptisms are not meant to terminate within us. They are meant to impel us forward as well, to make disciples of all nations, so that others might be baptized in the name of the Father and of the Son and of the Holy Spirit.</w:t>
       </w:r>
     </w:p>
     <w:p>
@@ -5108,7 +5108,7 @@
           <w:b w:val="0"/>
           <w:i w:val="0"/>
         </w:rPr>
-        <w:t>Every year on the feast day of St. Augustine, if you go on Instagram — which I do not ever recommend — you will find that some Catholic person likes to quote this one thing that St. Augustine apparently said: "I looked into my deepest wound, and there I saw your glory, and it dazzled me" [quotation wording unverified]. God rests in those deepest, darkest places in our hearts — those places we want to forget about, places where I have been hurt, where I have not received love. God is already there. As much as we invite him in, as much as we try to make him show up, he is already loving us.</w:t>
+        <w:t>Every year on the feast day of St. Augustine, if you go on Instagram — which I do not ever recommend — you will find that some Catholic person likes to quote this one thing that St. Augustine apparently said: "I looked into my deepest wound, and there I saw your glory, and it dazzled me". God rests in those deepest, darkest places in our hearts — those places we want to forget about, places where I have been hurt, where I have not received love. God is already there. As much as we invite him in, as much as we try to make him show up, he is already loving us.</w:t>
       </w:r>
     </w:p>
     <w:p>
@@ -6863,6 +6863,49 @@
           <w:b/>
           <w:i w:val="0"/>
         </w:rPr>
+        <w:t>St. Augustine (attribution doubtful — speaker hedges)</w:t>
+      </w:r>
+      <w:r>
+        <w:rPr>
+          <w:rFonts w:ascii="Garamond" w:hAnsi="Garamond"/>
+          <w:b w:val="0"/>
+          <w:i w:val="0"/>
+        </w:rPr>
+        <w:t xml:space="preserve">, </w:t>
+      </w:r>
+      <w:r>
+        <w:rPr>
+          <w:rFonts w:ascii="Garamond" w:hAnsi="Garamond"/>
+          <w:b w:val="0"/>
+          <w:i/>
+        </w:rPr>
+        <w:t>(no source located)</w:t>
+      </w:r>
+      <w:r>
+        <w:rPr>
+          <w:rFonts w:ascii="Garamond" w:hAnsi="Garamond"/>
+          <w:b w:val="0"/>
+          <w:i w:val="0"/>
+        </w:rPr>
+        <w:t>, —, —, —, —. — https://www.newadvent.org/fathers/110110.htm (accessed 2026-09-16)</w:t>
+      </w:r>
+    </w:p>
+    <w:p>
+      <w:pPr/>
+      <w:r>
+        <w:rPr>
+          <w:rFonts w:ascii="Garamond" w:hAnsi="Garamond"/>
+          <w:b w:val="0"/>
+          <w:i w:val="0"/>
+        </w:rPr>
+        <w:t xml:space="preserve">36. </w:t>
+      </w:r>
+      <w:r>
+        <w:rPr>
+          <w:rFonts w:ascii="Garamond" w:hAnsi="Garamond"/>
+          <w:b/>
+          <w:i w:val="0"/>
+        </w:rPr>
         <w:t>St. Paul</w:t>
       </w:r>
       <w:r>
@@ -6898,7 +6941,7 @@
           <w:b w:val="0"/>
           <w:i w:val="0"/>
         </w:rPr>
-        <w:t xml:space="preserve">36. </w:t>
+        <w:t xml:space="preserve">37. </w:t>
       </w:r>
       <w:r>
         <w:rPr>
@@ -6925,7 +6968,7 @@
           <w:b w:val="0"/>
           <w:i w:val="0"/>
         </w:rPr>
-        <w:t xml:space="preserve">37. </w:t>
+        <w:t xml:space="preserve">38. </w:t>
       </w:r>
       <w:r>
         <w:rPr>
@@ -6952,7 +6995,7 @@
           <w:b w:val="0"/>
           <w:i w:val="0"/>
         </w:rPr>
-        <w:t xml:space="preserve">38. </w:t>
+        <w:t xml:space="preserve">39. </w:t>
       </w:r>
       <w:r>
         <w:rPr>
@@ -6979,7 +7022,7 @@
           <w:b w:val="0"/>
           <w:i w:val="0"/>
         </w:rPr>
-        <w:t xml:space="preserve">39. </w:t>
+        <w:t xml:space="preserve">40. </w:t>
       </w:r>
       <w:r>
         <w:rPr>
@@ -7006,7 +7049,7 @@
           <w:b w:val="0"/>
           <w:i w:val="0"/>
         </w:rPr>
-        <w:t xml:space="preserve">40. </w:t>
+        <w:t xml:space="preserve">41. </w:t>
       </w:r>
       <w:r>
         <w:rPr>
@@ -7033,7 +7076,7 @@
           <w:b w:val="0"/>
           <w:i w:val="0"/>
         </w:rPr>
-        <w:t xml:space="preserve">41. </w:t>
+        <w:t xml:space="preserve">42. </w:t>
       </w:r>
       <w:r>
         <w:rPr>
@@ -7076,7 +7119,7 @@
           <w:b w:val="0"/>
           <w:i w:val="0"/>
         </w:rPr>
-        <w:t xml:space="preserve">42. </w:t>
+        <w:t xml:space="preserve">43. </w:t>
       </w:r>
       <w:r>
         <w:rPr>
@@ -7103,7 +7146,7 @@
           <w:b w:val="0"/>
           <w:i w:val="0"/>
         </w:rPr>
-        <w:t xml:space="preserve">43. </w:t>
+        <w:t xml:space="preserve">44. </w:t>
       </w:r>
       <w:r>
         <w:rPr>
@@ -7146,7 +7189,7 @@
           <w:b w:val="0"/>
           <w:i w:val="0"/>
         </w:rPr>
-        <w:t xml:space="preserve">44. </w:t>
+        <w:t xml:space="preserve">45. </w:t>
       </w:r>
       <w:r>
         <w:rPr>
@@ -7189,7 +7232,7 @@
           <w:b w:val="0"/>
           <w:i w:val="0"/>
         </w:rPr>
-        <w:t xml:space="preserve">45. </w:t>
+        <w:t xml:space="preserve">46. </w:t>
       </w:r>
       <w:r>
         <w:rPr>
@@ -7216,7 +7259,7 @@
           <w:b w:val="0"/>
           <w:i w:val="0"/>
         </w:rPr>
-        <w:t xml:space="preserve">46. </w:t>
+        <w:t xml:space="preserve">47. </w:t>
       </w:r>
       <w:r>
         <w:rPr>
@@ -7243,7 +7286,7 @@
           <w:b w:val="0"/>
           <w:i w:val="0"/>
         </w:rPr>
-        <w:t xml:space="preserve">47. </w:t>
+        <w:t xml:space="preserve">48. </w:t>
       </w:r>
       <w:r>
         <w:rPr>
@@ -7286,7 +7329,7 @@
           <w:b w:val="0"/>
           <w:i w:val="0"/>
         </w:rPr>
-        <w:t xml:space="preserve">48. </w:t>
+        <w:t xml:space="preserve">49. </w:t>
       </w:r>
       <w:r>
         <w:rPr>
@@ -7313,7 +7356,7 @@
           <w:b w:val="0"/>
           <w:i w:val="0"/>
         </w:rPr>
-        <w:t xml:space="preserve">49. </w:t>
+        <w:t xml:space="preserve">50. </w:t>
       </w:r>
       <w:r>
         <w:rPr>
@@ -7340,7 +7383,7 @@
           <w:b w:val="0"/>
           <w:i w:val="0"/>
         </w:rPr>
-        <w:t xml:space="preserve">50. </w:t>
+        <w:t xml:space="preserve">51. </w:t>
       </w:r>
       <w:r>
         <w:rPr>
@@ -7367,7 +7410,7 @@
           <w:b w:val="0"/>
           <w:i w:val="0"/>
         </w:rPr>
-        <w:t xml:space="preserve">51. </w:t>
+        <w:t xml:space="preserve">52. </w:t>
       </w:r>
       <w:r>
         <w:rPr>
@@ -7410,7 +7453,7 @@
           <w:b w:val="0"/>
           <w:i w:val="0"/>
         </w:rPr>
-        <w:t xml:space="preserve">52. </w:t>
+        <w:t xml:space="preserve">53. </w:t>
       </w:r>
       <w:r>
         <w:rPr>
@@ -7453,7 +7496,7 @@
           <w:b w:val="0"/>
           <w:i w:val="0"/>
         </w:rPr>
-        <w:t xml:space="preserve">53. </w:t>
+        <w:t xml:space="preserve">54. </w:t>
       </w:r>
       <w:r>
         <w:rPr>
@@ -7496,7 +7539,7 @@
           <w:b w:val="0"/>
           <w:i w:val="0"/>
         </w:rPr>
-        <w:t xml:space="preserve">54. </w:t>
+        <w:t xml:space="preserve">55. </w:t>
       </w:r>
       <w:r>
         <w:rPr>
@@ -7539,7 +7582,7 @@
           <w:b w:val="0"/>
           <w:i w:val="0"/>
         </w:rPr>
-        <w:t xml:space="preserve">55. </w:t>
+        <w:t xml:space="preserve">56. </w:t>
       </w:r>
       <w:r>
         <w:rPr>
@@ -7582,7 +7625,7 @@
           <w:b w:val="0"/>
           <w:i w:val="0"/>
         </w:rPr>
-        <w:t xml:space="preserve">56. </w:t>
+        <w:t xml:space="preserve">57. </w:t>
       </w:r>
       <w:r>
         <w:rPr>
@@ -7625,7 +7668,7 @@
           <w:b w:val="0"/>
           <w:i w:val="0"/>
         </w:rPr>
-        <w:t xml:space="preserve">57. </w:t>
+        <w:t xml:space="preserve">58. </w:t>
       </w:r>
       <w:r>
         <w:rPr>
@@ -7668,7 +7711,7 @@
           <w:b w:val="0"/>
           <w:i w:val="0"/>
         </w:rPr>
-        <w:t xml:space="preserve">58. </w:t>
+        <w:t xml:space="preserve">59. </w:t>
       </w:r>
       <w:r>
         <w:rPr>
@@ -7711,7 +7754,7 @@
           <w:b w:val="0"/>
           <w:i w:val="0"/>
         </w:rPr>
-        <w:t xml:space="preserve">59. </w:t>
+        <w:t xml:space="preserve">60. </w:t>
       </w:r>
       <w:r>
         <w:rPr>

</xml_diff>

<commit_message>
feat: EB Garamond PDF, final-version docx layout, Rednal assessment
- Rednal first-retreat recordings (F01/F02) transcribed (>=99.9%
  coverage) and compared vs the DOCX-based mine: NO substantial new
  material (verdict documented in work/review/rednal_mine_report.md);
  two audio-confirmed corrections applied to Ch2 ('a home of',
  'Father of mercies')
- PDF re-typeset in EB Garamond (OFL, downloaded to manuscript/fonts):
  88 pp, 18/18 checks, parity 0.998
- DOCX final-version layout: 4.25x6.875 pages, book margins, front
  matter (half-title -> note -> title -> blank -> live TOC field with
  page numbers), pageBreakBefore on all chapters, footer page
  numbers, bold headings confirmed
- Cover spine updated to 0.1982 in (88 pp)
</commit_message>
<xml_diff>
--- a/manuscript/Mystery_of_the_Trinity.docx
+++ b/manuscript/Mystery_of_the_Trinity.docx
@@ -4,7 +4,46 @@
   <w:body>
     <w:p>
       <w:pPr>
+        <w:pStyle w:val="HalfTitle"/>
+      </w:pPr>
+      <w:r>
+        <w:rPr>
+          <w:rFonts w:ascii="Garamond" w:hAnsi="Garamond"/>
+          <w:b w:val="0"/>
+          <w:i w:val="0"/>
+        </w:rPr>
+        <w:t>The Mystery of the Trinity</w:t>
+      </w:r>
+    </w:p>
+    <w:p>
+      <w:pPr>
+        <w:pStyle w:val="Chapter"/>
+        <w:pageBreakBefore/>
+      </w:pPr>
+      <w:r>
+        <w:rPr>
+          <w:rFonts w:ascii="Garamond" w:hAnsi="Garamond"/>
+          <w:b w:val="0"/>
+          <w:i w:val="0"/>
+        </w:rPr>
+        <w:t>Note on the Text</w:t>
+      </w:r>
+    </w:p>
+    <w:p>
+      <w:pPr/>
+      <w:r>
+        <w:rPr>
+          <w:rFonts w:ascii="Garamond" w:hAnsi="Garamond"/>
+          <w:b w:val="0"/>
+          <w:i w:val="0"/>
+        </w:rPr>
+        <w:t>This book was prepared from seven audio recordings of a retreat and a talk given by Fr. Peter Gruber, C.O., in 2025 and 2026. The text was produced by an auditable audio-to-book pipeline: each recording was machine-transcribed (faster-whisper, large-v3 model), reviewed against word-level confidence data, lightly corrected for grammar while preserving the author's spoken wording, and assembled into chapters, with a provenance record kept for every section of every chapter. Quotations were checked against published editions where possible; any wording or attribution that could not be verified is flagged in the project records and consolidated in the accompanying notes file. Scripture is cited as heard, with translation questions noted for the author.</w:t>
+      </w:r>
+    </w:p>
+    <w:p>
+      <w:pPr>
         <w:pStyle w:val="BookTitle"/>
+        <w:pageBreakBefore/>
       </w:pPr>
       <w:r>
         <w:rPr>
@@ -13,6 +52,20 @@
           <w:i w:val="0"/>
         </w:rPr>
         <w:t>The Mystery of the Trinity</w:t>
+      </w:r>
+    </w:p>
+    <w:p>
+      <w:pPr>
+        <w:spacing w:before="240"/>
+        <w:jc w:val="center"/>
+      </w:pPr>
+      <w:r>
+        <w:rPr>
+          <w:rFonts w:ascii="Garamond" w:hAnsi="Garamond"/>
+          <w:b w:val="0"/>
+          <w:i w:val="0"/>
+        </w:rPr>
+        <w:t>by Fr. Peter Gruber, C.O.</w:t>
       </w:r>
     </w:p>
     <w:p>
@@ -25,12 +78,18 @@
           <w:b w:val="0"/>
           <w:i w:val="0"/>
         </w:rPr>
-        <w:t>by Fr. Peter Gruber, C.O.</w:t>
-      </w:r>
+        <w:t>Working manuscript draft · 2026</w:t>
+      </w:r>
+    </w:p>
+    <w:p>
+      <w:pPr>
+        <w:pageBreakBefore/>
+      </w:pPr>
     </w:p>
     <w:p>
       <w:pPr>
         <w:pStyle w:val="Chapter"/>
+        <w:pageBreakBefore/>
       </w:pPr>
       <w:r>
         <w:rPr>
@@ -38,127 +97,38 @@
           <w:b w:val="0"/>
           <w:i w:val="0"/>
         </w:rPr>
-        <w:t>Note on the Text</w:t>
-      </w:r>
-    </w:p>
-    <w:p>
-      <w:pPr/>
-      <w:r>
-        <w:rPr>
-          <w:rFonts w:ascii="Garamond" w:hAnsi="Garamond"/>
-          <w:b w:val="0"/>
-          <w:i w:val="0"/>
-        </w:rPr>
-        <w:t>This book was prepared from seven audio recordings of a retreat and a talk given by Fr. Peter Gruber, C.O., in 2025 and 2026. The text was produced by an auditable audio-to-book pipeline: each recording was machine-transcribed (faster-whisper, large-v3 model), reviewed against word-level confidence data, lightly corrected for grammar while preserving the author's spoken wording, and assembled into chapters, with a provenance record kept for every section of every chapter. Quotations were checked against published editions where possible; any wording or attribution that could not be verified is flagged in the project records and consolidated in the accompanying notes file. Scripture is cited as heard, with translation questions noted for the author.</w:t>
+        <w:t>Table of Contents</w:t>
+      </w:r>
+    </w:p>
+    <w:p>
+      <w:pPr/>
+      <w:r>
+        <w:rPr>
+          <w:rFonts w:ascii="Garamond" w:hAnsi="Garamond"/>
+          <w:sz w:val="24"/>
+        </w:rPr>
+        <w:fldChar w:fldCharType="begin" w:dirty="true"/>
+        <w:instrText xml:space="preserve"> TOC \t "Chapter,1,Section,2" \h \z \u </w:instrText>
+        <w:fldChar w:fldCharType="separate"/>
+        <w:t>Right-click here and choose 'Update Field' to build the table of contents.</w:t>
+        <w:fldChar w:fldCharType="end"/>
+      </w:r>
+    </w:p>
+    <w:p>
+      <w:pPr/>
+      <w:r>
+        <w:rPr>
+          <w:rFonts w:ascii="Garamond" w:hAnsi="Garamond"/>
+          <w:b w:val="0"/>
+          <w:i w:val="0"/>
+        </w:rPr>
+        <w:t>(Select and update this table in Word to fill in page numbers.)</w:t>
       </w:r>
     </w:p>
     <w:p>
       <w:pPr>
         <w:pStyle w:val="Chapter"/>
-      </w:pPr>
-      <w:r>
-        <w:rPr>
-          <w:rFonts w:ascii="Garamond" w:hAnsi="Garamond"/>
-          <w:b w:val="0"/>
-          <w:i w:val="0"/>
-        </w:rPr>
-        <w:t>Table of Contents</w:t>
-      </w:r>
-    </w:p>
-    <w:p>
-      <w:pPr>
-        <w:pStyle w:val="TOCEntry"/>
-      </w:pPr>
-      <w:r>
-        <w:rPr>
-          <w:rFonts w:ascii="Garamond" w:hAnsi="Garamond"/>
-          <w:b w:val="0"/>
-          <w:i w:val="0"/>
-        </w:rPr>
-        <w:t>Chapter 1 — Icons of the Trinity</w:t>
-      </w:r>
-    </w:p>
-    <w:p>
-      <w:pPr>
-        <w:pStyle w:val="TOCEntry"/>
-      </w:pPr>
-      <w:r>
-        <w:rPr>
-          <w:rFonts w:ascii="Garamond" w:hAnsi="Garamond"/>
-          <w:b w:val="0"/>
-          <w:i w:val="0"/>
-        </w:rPr>
-        <w:t>Chapter 2 — Mystery</w:t>
-      </w:r>
-    </w:p>
-    <w:p>
-      <w:pPr>
-        <w:pStyle w:val="TOCEntry"/>
-      </w:pPr>
-      <w:r>
-        <w:rPr>
-          <w:rFonts w:ascii="Garamond" w:hAnsi="Garamond"/>
-          <w:b w:val="0"/>
-          <w:i w:val="0"/>
-        </w:rPr>
-        <w:t>Chapter 3 — Gift and Liturgy</w:t>
-      </w:r>
-    </w:p>
-    <w:p>
-      <w:pPr>
-        <w:pStyle w:val="TOCEntry"/>
-      </w:pPr>
-      <w:r>
-        <w:rPr>
-          <w:rFonts w:ascii="Garamond" w:hAnsi="Garamond"/>
-          <w:b w:val="0"/>
-          <w:i w:val="0"/>
-        </w:rPr>
-        <w:t>Chapter 4 — Relationship</w:t>
-      </w:r>
-    </w:p>
-    <w:p>
-      <w:pPr>
-        <w:pStyle w:val="TOCEntry"/>
-      </w:pPr>
-      <w:r>
-        <w:rPr>
-          <w:rFonts w:ascii="Garamond" w:hAnsi="Garamond"/>
-          <w:b w:val="0"/>
-          <w:i w:val="0"/>
-        </w:rPr>
-        <w:t>Chapter 5 — Intimacy</w:t>
-      </w:r>
-    </w:p>
-    <w:p>
-      <w:pPr>
-        <w:pStyle w:val="TOCEntry"/>
-      </w:pPr>
-      <w:r>
-        <w:rPr>
-          <w:rFonts w:ascii="Garamond" w:hAnsi="Garamond"/>
-          <w:b w:val="0"/>
-          <w:i w:val="0"/>
-        </w:rPr>
-        <w:t>Chapter 6 — Evangelization</w:t>
-      </w:r>
-    </w:p>
-    <w:p>
-      <w:pPr>
-        <w:pStyle w:val="TOCEntry"/>
-      </w:pPr>
-      <w:r>
-        <w:rPr>
-          <w:rFonts w:ascii="Garamond" w:hAnsi="Garamond"/>
-          <w:b w:val="0"/>
-          <w:i w:val="0"/>
-        </w:rPr>
-        <w:t>Epilogue — Engineering Mystery</w:t>
-      </w:r>
-    </w:p>
-    <w:p>
-      <w:pPr>
-        <w:pStyle w:val="Chapter"/>
+        <w:pageBreakBefore/>
       </w:pPr>
       <w:r>
         <w:rPr>
@@ -718,6 +688,7 @@
     <w:p>
       <w:pPr>
         <w:pStyle w:val="Chapter"/>
+        <w:pageBreakBefore/>
       </w:pPr>
       <w:r>
         <w:rPr>
@@ -835,7 +806,7 @@
           <w:b w:val="0"/>
           <w:i w:val="0"/>
         </w:rPr>
-        <w:t>I once heard a speaker at a FOCUS conference tell about a conversation he had when he was a Protestant. His Catholic friend got him to meet up with a Jesuit priest — supposedly a good Jesuit — and the priest asked him, "What is the central mystery of our faith?" The man, since he was a Protestant, answered, trying to be a little bit edgy: "Justification by faith alone." And the priest said, "It is the Trinity." The man said, "Oh yeah — that is right. It is the love that made the sun and the stars: the love shared between Father, Son, and the Holy Spirit that spills out into all creation. And then, even though we fell, by God's mercy extended to us through the Trinity — God the Father of mercy; the death and resurrection of his Son; the Holy Spirit sent among us for the forgiveness of sins — the whole action of the Trinity comes to redeem us and bring us back to himself. The Trinity is the central faith. It is the Trinity that we will gaze on — and partake of — through Christ, in the beatific vision, where God gives us his very self through which to understand him."</w:t>
+        <w:t>I once heard a speaker at a FOCUS conference tell about a conversation he had when he was a Protestant. His Catholic friend got him to meet up with a Jesuit priest — supposedly a good Jesuit — and the priest asked him, "What is the central mystery of our faith?" The man, since he was a Protestant, answered, trying to be a little bit edgy: "Justification by faith alone." And the priest said, "It is the Trinity." The man said, "Oh yeah — that is right. It is the love that made the sun and the stars: the love shared between Father, Son, and the Holy Spirit that spills out into all creation. And then, even though we fell, by God's mercy extended to us through the Trinity — God the Father of mercies; the death and resurrection of his Son; the Holy Spirit sent among us for the forgiveness of sins — the whole action of the Trinity comes to redeem us and bring us back to himself. The Trinity is the central faith. It is the Trinity that we will gaze on — and partake of — through Christ, in the beatific vision, where God gives us his very self through which to understand him."</w:t>
       </w:r>
     </w:p>
     <w:p>
@@ -1513,7 +1484,7 @@
           <w:b w:val="0"/>
           <w:i w:val="0"/>
         </w:rPr>
-        <w:t>And that Trinity that made the sun and the stars — the moon in the sky that follows us as we traverse long distances — that Trinity is within us. For God has come to dwell in our hearts, and he is within. We have been baptized into Christ, and we have been given this Holy Trinity as an indwelling within us — to be at home in Father, Son, and Holy Spirit — even as we ache to be in that home of the Father's house in heaven.</w:t>
+        <w:t>And that Trinity that made the sun and the stars — the moon in the sky that follows us as we traverse long distances — that Trinity is within us. For God has come to dwell in our hearts, and he is within. We have been baptized into Christ, and we have been given this Holy Trinity as an indwelling within us — to be a home of Father, Son, and Holy Spirit — even as we ache to be in that home of the Father's house in heaven.</w:t>
       </w:r>
     </w:p>
     <w:p>
@@ -1541,6 +1512,7 @@
     <w:p>
       <w:pPr>
         <w:pStyle w:val="Chapter"/>
+        <w:pageBreakBefore/>
       </w:pPr>
       <w:r>
         <w:rPr>
@@ -2319,6 +2291,7 @@
     <w:p>
       <w:pPr>
         <w:pStyle w:val="Chapter"/>
+        <w:pageBreakBefore/>
       </w:pPr>
       <w:r>
         <w:rPr>
@@ -2785,6 +2758,7 @@
     <w:p>
       <w:pPr>
         <w:pStyle w:val="Chapter"/>
+        <w:pageBreakBefore/>
       </w:pPr>
       <w:r>
         <w:rPr>
@@ -3690,6 +3664,7 @@
     <w:p>
       <w:pPr>
         <w:pStyle w:val="Chapter"/>
+        <w:pageBreakBefore/>
       </w:pPr>
       <w:r>
         <w:rPr>
@@ -4418,6 +4393,7 @@
     <w:p>
       <w:pPr>
         <w:pStyle w:val="Chapter"/>
+        <w:pageBreakBefore/>
       </w:pPr>
       <w:r>
         <w:rPr>
@@ -5476,6 +5452,7 @@
     <w:p>
       <w:pPr>
         <w:pStyle w:val="Chapter"/>
+        <w:pageBreakBefore/>
       </w:pPr>
       <w:r>
         <w:rPr>
@@ -6287,13 +6264,38 @@
       </w:r>
     </w:p>
     <w:sectPr>
-      <w:pgSz w:w="12240" w:h="15840"/>
-      <w:pgMar w:top="1440" w:right="1800" w:bottom="1440" w:left="1800" w:header="720" w:footer="720" w:gutter="0"/>
+      <w:footerReference w:type="default" r:id="rId9"/>
+      <w:pgSz w:w="6120" w:h="9900"/>
+      <w:pgMar w:top="1152" w:right="720" w:bottom="936" w:left="720" w:header="720" w:footer="576" w:gutter="0"/>
       <w:cols w:space="720"/>
+      <w:titlePg/>
       <w:docGrid w:linePitch="360"/>
     </w:sectPr>
   </w:body>
 </w:document>
+</file>
+
+<file path=word/footer1.xml><?xml version="1.0" encoding="utf-8"?>
+<w:ftr xmlns:m="http://schemas.openxmlformats.org/officeDocument/2006/math" xmlns:mc="http://schemas.openxmlformats.org/markup-compatibility/2006" xmlns:mo="http://schemas.microsoft.com/office/mac/office/2008/main" xmlns:mv="urn:schemas-microsoft-com:mac:vml" xmlns:o="urn:schemas-microsoft-com:office:office" xmlns:r="http://schemas.openxmlformats.org/officeDocument/2006/relationships" xmlns:v="urn:schemas-microsoft-com:vml" xmlns:w10="urn:schemas-microsoft-com:office:word" xmlns:w14="http://schemas.microsoft.com/office/word/2010/wordml" xmlns:w="http://schemas.openxmlformats.org/wordprocessingml/2006/main" xmlns:wne="http://schemas.microsoft.com/office/word/2006/wordml" xmlns:wp14="http://schemas.microsoft.com/office/word/2010/wordprocessingDrawing" xmlns:wp="http://schemas.openxmlformats.org/drawingml/2006/wordprocessingDrawing" xmlns:wpc="http://schemas.microsoft.com/office/word/2010/wordprocessingCanvas" xmlns:wpg="http://schemas.microsoft.com/office/word/2010/wordprocessingGroup" xmlns:wpi="http://schemas.microsoft.com/office/word/2010/wordprocessingInk" xmlns:wps="http://schemas.microsoft.com/office/word/2010/wordprocessingShape" mc:Ignorable="w14 wp14">
+  <w:p>
+    <w:pPr>
+      <w:pStyle w:val="Footer"/>
+      <w:spacing w:after="0"/>
+      <w:jc w:val="center"/>
+    </w:pPr>
+    <w:r>
+      <w:rPr>
+        <w:rFonts w:ascii="Garamond" w:hAnsi="Garamond"/>
+        <w:sz w:val="16"/>
+      </w:rPr>
+      <w:fldChar w:fldCharType="begin"/>
+      <w:instrText xml:space="preserve"> PAGE </w:instrText>
+      <w:fldChar w:fldCharType="separate"/>
+      <w:t>1</w:t>
+      <w:fldChar w:fldCharType="end"/>
+    </w:r>
+  </w:p>
+</w:ftr>
 </file>
 
 <file path=word/numbering.xml><?xml version="1.0" encoding="utf-8"?>
@@ -18336,6 +18338,17 @@
       </w:tcPr>
     </w:tblStylePr>
   </w:style>
+  <w:style w:type="paragraph" w:customStyle="1" w:styleId="HalfTitle">
+    <w:name w:val="Half Title"/>
+    <w:basedOn w:val="Normal"/>
+    <w:pPr>
+      <w:jc w:val="center"/>
+    </w:pPr>
+    <w:rPr>
+      <w:rFonts w:ascii="Garamond" w:hAnsi="Garamond"/>
+      <w:sz w:val="44"/>
+    </w:rPr>
+  </w:style>
   <w:style w:type="paragraph" w:customStyle="1" w:styleId="BookTitle">
     <w:name w:val="Book Title"/>
     <w:basedOn w:val="Normal"/>
@@ -18386,17 +18399,6 @@
     <w:rPr>
       <w:rFonts w:ascii="Garamond" w:hAnsi="Garamond"/>
       <w:i/>
-      <w:sz w:val="24"/>
-    </w:rPr>
-  </w:style>
-  <w:style w:type="paragraph" w:customStyle="1" w:styleId="TOCEntry">
-    <w:name w:val="TOC Entry"/>
-    <w:basedOn w:val="Normal"/>
-    <w:pPr>
-      <w:spacing w:after="0"/>
-    </w:pPr>
-    <w:rPr>
-      <w:rFonts w:ascii="Garamond" w:hAnsi="Garamond"/>
       <w:sz w:val="24"/>
     </w:rPr>
   </w:style>

</xml_diff>